<commit_message>
Initial commit of project
</commit_message>
<xml_diff>
--- a/public/myresume.docx
+++ b/public/myresume.docx
@@ -19,16 +19,22 @@
         </w:rPr>
         <w:t xml:space="preserve">Manjunath </w:t>
       </w:r>
-      <w:proofErr w:type="spellStart"/>
       <w:r>
         <w:rPr>
           <w:b/>
           <w:sz w:val="24"/>
           <w:szCs w:val="24"/>
         </w:rPr>
-        <w:t>kavalikai</w:t>
-      </w:r>
-      <w:proofErr w:type="spellEnd"/>
+        <w:t>K</w:t>
+      </w:r>
+      <w:r>
+        <w:rPr>
+          <w:b/>
+          <w:sz w:val="24"/>
+          <w:szCs w:val="24"/>
+        </w:rPr>
+        <w:t>avalikai</w:t>
+      </w:r>
     </w:p>
     <w:p>
       <w:pPr>
@@ -59,7 +65,6 @@
         <w:t xml:space="preserve"> | +91 935301 9944 | Dharwad | </w:t>
       </w:r>
       <w:hyperlink r:id="rId6">
-        <w:proofErr w:type="spellStart"/>
         <w:r>
           <w:rPr>
             <w:b/>
@@ -70,7 +75,6 @@
           </w:rPr>
           <w:t>Github</w:t>
         </w:r>
-        <w:proofErr w:type="spellEnd"/>
       </w:hyperlink>
       <w:r>
         <w:rPr>
@@ -81,7 +85,6 @@
         <w:t xml:space="preserve"> | </w:t>
       </w:r>
       <w:hyperlink r:id="rId7" w:history="1">
-        <w:proofErr w:type="spellStart"/>
         <w:r>
           <w:rPr>
             <w:rStyle w:val="Hyperlink"/>
@@ -91,7 +94,6 @@
           </w:rPr>
           <w:t>Linkedin</w:t>
         </w:r>
-        <w:proofErr w:type="spellEnd"/>
       </w:hyperlink>
       <w:r>
         <w:rPr>
@@ -171,25 +173,7 @@
           <w:sz w:val="20"/>
           <w:szCs w:val="20"/>
         </w:rPr>
-        <w:t xml:space="preserve">Aspiring Data Analyst with expertise in data visualization, wrangling, statistical analysis, and predictive </w:t>
-      </w:r>
-      <w:proofErr w:type="spellStart"/>
-      <w:r>
-        <w:rPr>
-          <w:color w:val="000000"/>
-          <w:sz w:val="20"/>
-          <w:szCs w:val="20"/>
-        </w:rPr>
-        <w:t>modeling</w:t>
-      </w:r>
-      <w:proofErr w:type="spellEnd"/>
-      <w:r>
-        <w:rPr>
-          <w:color w:val="000000"/>
-          <w:sz w:val="20"/>
-          <w:szCs w:val="20"/>
-        </w:rPr>
-        <w:t>. Proficient in SQL, Python, Power BI, Tableau, and Excel, with hands-on experience in ETL, automation, and dashboarding. Strong problem-solving skills, eager to apply analytical expertise in a data-driven environment</w:t>
+        <w:t>Aspiring Data Analyst with expertise in data visualization, wrangling, statistical analysis, and predictive modeling. Proficient in SQL, Python, Power BI, Tableau, and Excel, with hands-on experience in ETL, automation, and dashboarding. Strong problem-solving skills, eager to apply analytical expertise in a data-driven environment</w:t>
       </w:r>
       <w:r>
         <w:pict w14:anchorId="78AD5002">
@@ -325,15 +309,7 @@
           <w:sz w:val="20"/>
           <w:szCs w:val="20"/>
         </w:rPr>
-        <w:t xml:space="preserve"> Python (Pandas, NumPy, Scikit-learn</w:t>
-      </w:r>
-      <w:proofErr w:type="gramStart"/>
-      <w:r>
-        <w:rPr>
-          <w:sz w:val="20"/>
-          <w:szCs w:val="20"/>
-        </w:rPr>
-        <w:t>)</w:t>
+        <w:t xml:space="preserve"> Python (Pandas, NumPy, Scikit-learn)</w:t>
       </w:r>
       <w:r>
         <w:rPr>
@@ -342,7 +318,6 @@
         </w:rPr>
         <w:t>,C++</w:t>
       </w:r>
-      <w:proofErr w:type="gramEnd"/>
       <w:r>
         <w:rPr>
           <w:sz w:val="20"/>
@@ -399,15 +374,57 @@
         </w:rPr>
         <w:t xml:space="preserve"> </w:t>
       </w:r>
-      <w:proofErr w:type="spellStart"/>
-      <w:r>
-        <w:rPr>
-          <w:sz w:val="20"/>
-          <w:szCs w:val="20"/>
-        </w:rPr>
-        <w:t>Javascript</w:t>
-      </w:r>
-      <w:proofErr w:type="spellEnd"/>
+      <w:r>
+        <w:rPr>
+          <w:sz w:val="20"/>
+          <w:szCs w:val="20"/>
+        </w:rPr>
+        <w:t>Javascript,</w:t>
+      </w:r>
+    </w:p>
+    <w:p>
+      <w:pPr>
+        <w:spacing w:line="360" w:lineRule="auto"/>
+        <w:rPr>
+          <w:sz w:val="20"/>
+          <w:szCs w:val="20"/>
+        </w:rPr>
+      </w:pPr>
+      <w:r>
+        <w:rPr>
+          <w:sz w:val="20"/>
+          <w:szCs w:val="20"/>
+        </w:rPr>
+        <w:t>React JS, Next JS, Tailwind CSS</w:t>
+      </w:r>
+      <w:r>
+        <w:rPr>
+          <w:sz w:val="20"/>
+          <w:szCs w:val="20"/>
+        </w:rPr>
+        <w:t>, C</w:t>
+      </w:r>
+      <w:r>
+        <w:rPr>
+          <w:sz w:val="20"/>
+          <w:szCs w:val="20"/>
+        </w:rPr>
+        <w:t>-</w:t>
+      </w:r>
+      <w:r>
+        <w:rPr>
+          <w:sz w:val="20"/>
+          <w:szCs w:val="20"/>
+        </w:rPr>
+        <w:t>Sharp</w:t>
+      </w:r>
+      <w:r>
+        <w:rPr>
+          <w:sz w:val="20"/>
+          <w:szCs w:val="20"/>
+        </w:rPr>
+        <w:t>, Django</w:t>
+      </w:r>
       <w:r>
         <w:rPr>
           <w:sz w:val="20"/>
@@ -415,6 +432,34 @@
         </w:rPr>
         <w:t>,</w:t>
       </w:r>
+      <w:r>
+        <w:rPr>
+          <w:sz w:val="20"/>
+          <w:szCs w:val="20"/>
+        </w:rPr>
+        <w:t xml:space="preserve"> </w:t>
+      </w:r>
+      <w:r>
+        <w:rPr>
+          <w:sz w:val="20"/>
+          <w:szCs w:val="20"/>
+        </w:rPr>
+        <w:t>jQuery, Bootstrap</w:t>
+      </w:r>
+      <w:r>
+        <w:rPr>
+          <w:sz w:val="20"/>
+          <w:szCs w:val="20"/>
+        </w:rPr>
+        <w:t>, Data Structure in Python</w:t>
+      </w:r>
+      <w:r>
+        <w:rPr>
+          <w:sz w:val="20"/>
+          <w:szCs w:val="20"/>
+        </w:rPr>
+        <w:t>,Fire Base</w:t>
+      </w:r>
     </w:p>
     <w:p>
       <w:pPr>
@@ -426,75 +471,18 @@
       </w:pPr>
       <w:r>
         <w:rPr>
-          <w:sz w:val="20"/>
-          <w:szCs w:val="20"/>
-        </w:rPr>
-        <w:t>React JS, Next JS, Tailwind CSS</w:t>
-      </w:r>
-      <w:r>
-        <w:rPr>
-          <w:sz w:val="20"/>
-          <w:szCs w:val="20"/>
-        </w:rPr>
-        <w:t>, C</w:t>
-      </w:r>
-      <w:r>
-        <w:rPr>
-          <w:sz w:val="20"/>
-          <w:szCs w:val="20"/>
-        </w:rPr>
-        <w:t>-</w:t>
-      </w:r>
-      <w:r>
-        <w:rPr>
-          <w:sz w:val="20"/>
-          <w:szCs w:val="20"/>
-        </w:rPr>
-        <w:t>Sharp</w:t>
-      </w:r>
-      <w:r>
-        <w:rPr>
-          <w:sz w:val="20"/>
-          <w:szCs w:val="20"/>
-        </w:rPr>
-        <w:t xml:space="preserve">, </w:t>
-      </w:r>
-      <w:proofErr w:type="spellStart"/>
-      <w:r>
-        <w:rPr>
-          <w:sz w:val="20"/>
-          <w:szCs w:val="20"/>
-        </w:rPr>
-        <w:t>Django</w:t>
-      </w:r>
-      <w:r>
-        <w:rPr>
-          <w:sz w:val="20"/>
-          <w:szCs w:val="20"/>
-        </w:rPr>
-        <w:t>,</w:t>
-      </w:r>
-      <w:r>
-        <w:rPr>
-          <w:sz w:val="20"/>
-          <w:szCs w:val="20"/>
-        </w:rPr>
-        <w:t>jQuery</w:t>
-      </w:r>
-      <w:proofErr w:type="spellEnd"/>
-      <w:r>
-        <w:rPr>
-          <w:sz w:val="20"/>
-          <w:szCs w:val="20"/>
-        </w:rPr>
-        <w:t>, Bootstrap</w:t>
-      </w:r>
-      <w:r>
-        <w:rPr>
-          <w:sz w:val="20"/>
-          <w:szCs w:val="20"/>
-        </w:rPr>
-        <w:t>, Data Structure in Python</w:t>
+          <w:b/>
+          <w:sz w:val="20"/>
+          <w:szCs w:val="20"/>
+        </w:rPr>
+        <w:t>Machine Learning:</w:t>
+      </w:r>
+      <w:r>
+        <w:rPr>
+          <w:sz w:val="20"/>
+          <w:szCs w:val="20"/>
+        </w:rPr>
+        <w:t xml:space="preserve"> Supervised &amp; Unsupervised Learning &amp; Regression</w:t>
       </w:r>
     </w:p>
     <w:p>
@@ -511,30 +499,6 @@
           <w:sz w:val="20"/>
           <w:szCs w:val="20"/>
         </w:rPr>
-        <w:t>Machine Learning:</w:t>
-      </w:r>
-      <w:r>
-        <w:rPr>
-          <w:sz w:val="20"/>
-          <w:szCs w:val="20"/>
-        </w:rPr>
-        <w:t xml:space="preserve"> Supervised &amp; Unsupervised Learning &amp; Regression</w:t>
-      </w:r>
-    </w:p>
-    <w:p>
-      <w:pPr>
-        <w:spacing w:line="360" w:lineRule="auto"/>
-        <w:rPr>
-          <w:sz w:val="20"/>
-          <w:szCs w:val="20"/>
-        </w:rPr>
-      </w:pPr>
-      <w:r>
-        <w:rPr>
-          <w:b/>
-          <w:sz w:val="20"/>
-          <w:szCs w:val="20"/>
-        </w:rPr>
         <w:t>Database Management:</w:t>
       </w:r>
       <w:r>
@@ -543,6 +507,13 @@
           <w:szCs w:val="20"/>
         </w:rPr>
         <w:t xml:space="preserve"> MySQL, PostgreSQL</w:t>
+      </w:r>
+      <w:r>
+        <w:rPr>
+          <w:sz w:val="20"/>
+          <w:szCs w:val="20"/>
+        </w:rPr>
+        <w:t>, No sql, Mongo DB</w:t>
       </w:r>
     </w:p>
     <w:p>
@@ -700,39 +671,7 @@
           <w:sz w:val="20"/>
           <w:szCs w:val="20"/>
         </w:rPr>
-        <w:t xml:space="preserve"> </w:t>
-      </w:r>
-      <w:proofErr w:type="spellStart"/>
-      <w:r>
-        <w:rPr>
-          <w:sz w:val="20"/>
-          <w:szCs w:val="20"/>
-        </w:rPr>
-        <w:t>analyzing</w:t>
-      </w:r>
-      <w:proofErr w:type="spellEnd"/>
-      <w:r>
-        <w:rPr>
-          <w:sz w:val="20"/>
-          <w:szCs w:val="20"/>
-        </w:rPr>
-        <w:t xml:space="preserve"> sales trends and customer </w:t>
-      </w:r>
-      <w:proofErr w:type="spellStart"/>
-      <w:r>
-        <w:rPr>
-          <w:sz w:val="20"/>
-          <w:szCs w:val="20"/>
-        </w:rPr>
-        <w:t>behavior</w:t>
-      </w:r>
-      <w:proofErr w:type="spellEnd"/>
-      <w:r>
-        <w:rPr>
-          <w:sz w:val="20"/>
-          <w:szCs w:val="20"/>
-        </w:rPr>
-        <w:t>.</w:t>
+        <w:t xml:space="preserve"> analyzing sales trends and customer behavior.</w:t>
       </w:r>
     </w:p>
     <w:p>
@@ -1056,72 +995,6 @@
           <w:szCs w:val="20"/>
         </w:rPr>
         <w:t xml:space="preserve"> for trend analysis.</w:t>
-      </w:r>
-    </w:p>
-    <w:p>
-      <w:pPr>
-        <w:keepLines/>
-        <w:spacing w:after="240" w:line="240" w:lineRule="auto"/>
-        <w:rPr>
-          <w:b/>
-          <w:bCs/>
-          <w:sz w:val="20"/>
-          <w:szCs w:val="20"/>
-        </w:rPr>
-      </w:pPr>
-      <w:r>
-        <w:rPr>
-          <w:b/>
-          <w:bCs/>
-          <w:sz w:val="20"/>
-          <w:szCs w:val="20"/>
-        </w:rPr>
-        <w:t>5.</w:t>
-      </w:r>
-      <w:r>
-        <w:rPr>
-          <w:b/>
-          <w:bCs/>
-          <w:sz w:val="20"/>
-          <w:szCs w:val="20"/>
-        </w:rPr>
-        <w:t xml:space="preserve"> </w:t>
-      </w:r>
-      <w:r>
-        <w:rPr>
-          <w:b/>
-          <w:bCs/>
-          <w:sz w:val="20"/>
-          <w:szCs w:val="20"/>
-        </w:rPr>
-        <w:t xml:space="preserve">JOB TITLE </w:t>
-      </w:r>
-      <w:r>
-        <w:rPr>
-          <w:b/>
-          <w:bCs/>
-          <w:sz w:val="20"/>
-          <w:szCs w:val="20"/>
-        </w:rPr>
-        <w:t>– D</w:t>
-      </w:r>
-      <w:r>
-        <w:rPr>
-          <w:b/>
-          <w:bCs/>
-          <w:sz w:val="20"/>
-          <w:szCs w:val="20"/>
-        </w:rPr>
-        <w:t>ata</w:t>
-      </w:r>
-      <w:r>
-        <w:rPr>
-          <w:b/>
-          <w:bCs/>
-          <w:sz w:val="20"/>
-          <w:szCs w:val="20"/>
-        </w:rPr>
-        <w:t xml:space="preserve"> Analyst</w:t>
       </w:r>
     </w:p>
     <w:sectPr>

</xml_diff>